<commit_message>
Updated Document and created new Debug Screen
</commit_message>
<xml_diff>
--- a/== DOCUMENTS ==/MMC_Document.docx
+++ b/== DOCUMENTS ==/MMC_Document.docx
@@ -1,6 +1,6 @@
 
 <file path=word/document.xml><?xml version="1.0" encoding="utf-8"?>
-<w:document xmlns:wpc="http://schemas.microsoft.com/office/word/2010/wordprocessingCanvas" xmlns:cx="http://schemas.microsoft.com/office/drawing/2014/chartex" xmlns:cx1="http://schemas.microsoft.com/office/drawing/2015/9/8/chartex" xmlns:cx2="http://schemas.microsoft.com/office/drawing/2015/10/21/chartex" xmlns:cx3="http://schemas.microsoft.com/office/drawing/2016/5/9/chartex" xmlns:cx4="http://schemas.microsoft.com/office/drawing/2016/5/10/chartex" xmlns:cx5="http://schemas.microsoft.com/office/drawing/2016/5/11/chartex" xmlns:cx6="http://schemas.microsoft.com/office/drawing/2016/5/12/chartex" xmlns:cx7="http://schemas.microsoft.com/office/drawing/2016/5/13/chartex" xmlns:cx8="http://schemas.microsoft.com/office/drawing/2016/5/14/chartex" xmlns:mc="http://schemas.openxmlformats.org/markup-compatibility/2006" xmlns:aink="http://schemas.microsoft.com/office/drawing/2016/ink" xmlns:am3d="http://schemas.microsoft.com/office/drawing/2017/model3d" xmlns:o="urn:schemas-microsoft-com:office:office" xmlns:oel="http://schemas.microsoft.com/office/2019/extlst" xmlns:r="http://schemas.openxmlformats.org/officeDocument/2006/relationships" xmlns:m="http://schemas.openxmlformats.org/officeDocument/2006/math" xmlns:v="urn:schemas-microsoft-com:vml" xmlns:wp14="http://schemas.microsoft.com/office/word/2010/wordprocessingDrawing" xmlns:wp="http://schemas.openxmlformats.org/drawingml/2006/wordprocessingDrawing" xmlns:w10="urn:schemas-microsoft-com:office:word" xmlns:w="http://schemas.openxmlformats.org/wordprocessingml/2006/main" xmlns:w14="http://schemas.microsoft.com/office/word/2010/wordml" xmlns:w15="http://schemas.microsoft.com/office/word/2012/wordml" xmlns:w16cex="http://schemas.microsoft.com/office/word/2018/wordml/cex" xmlns:w16cid="http://schemas.microsoft.com/office/word/2016/wordml/cid" xmlns:w16="http://schemas.microsoft.com/office/word/2018/wordml" xmlns:w16du="http://schemas.microsoft.com/office/word/2023/wordml/word16du" xmlns:w16sdtdh="http://schemas.microsoft.com/office/word/2020/wordml/sdtdatahash" xmlns:w16sdtfl="http://schemas.microsoft.com/office/word/2024/wordml/sdtformatlock" xmlns:w16se="http://schemas.microsoft.com/office/word/2015/wordml/symex" xmlns:wpg="http://schemas.microsoft.com/office/word/2010/wordprocessingGroup" xmlns:wpi="http://schemas.microsoft.com/office/word/2010/wordprocessingInk" xmlns:wne="http://schemas.microsoft.com/office/word/2006/wordml" xmlns:wps="http://schemas.microsoft.com/office/word/2010/wordprocessingShape" mc:Ignorable="w14 w15 w16se w16cid w16 w16cex w16sdtdh w16sdtfl w16du wp14">
+<w:document xmlns:wpc="http://schemas.microsoft.com/office/word/2010/wordprocessingCanvas" xmlns:cx="http://schemas.microsoft.com/office/drawing/2014/chartex" xmlns:cx1="http://schemas.microsoft.com/office/drawing/2015/9/8/chartex" xmlns:cx2="http://schemas.microsoft.com/office/drawing/2015/10/21/chartex" xmlns:cx3="http://schemas.microsoft.com/office/drawing/2016/5/9/chartex" xmlns:cx4="http://schemas.microsoft.com/office/drawing/2016/5/10/chartex" xmlns:cx5="http://schemas.microsoft.com/office/drawing/2016/5/11/chartex" xmlns:cx6="http://schemas.microsoft.com/office/drawing/2016/5/12/chartex" xmlns:cx7="http://schemas.microsoft.com/office/drawing/2016/5/13/chartex" xmlns:cx8="http://schemas.microsoft.com/office/drawing/2016/5/14/chartex" xmlns:mc="http://schemas.openxmlformats.org/markup-compatibility/2006" xmlns:aink="http://schemas.microsoft.com/office/drawing/2016/ink" xmlns:am3d="http://schemas.microsoft.com/office/drawing/2017/model3d" xmlns:o="urn:schemas-microsoft-com:office:office" xmlns:oel="http://schemas.microsoft.com/office/2019/extlst" xmlns:r="http://schemas.openxmlformats.org/officeDocument/2006/relationships" xmlns:m="http://schemas.openxmlformats.org/officeDocument/2006/math" xmlns:v="urn:schemas-microsoft-com:vml" xmlns:wp14="http://schemas.microsoft.com/office/word/2010/wordprocessingDrawing" xmlns:wp="http://schemas.openxmlformats.org/drawingml/2006/wordprocessingDrawing" xmlns:w10="urn:schemas-microsoft-com:office:word" xmlns:w="http://schemas.openxmlformats.org/wordprocessingml/2006/main" xmlns:w14="http://schemas.microsoft.com/office/word/2010/wordml" xmlns:w15="http://schemas.microsoft.com/office/word/2012/wordml" xmlns:w16cei="http://schemas.microsoft.com/office/word/2026/wordml/cei" xmlns:w16cex="http://schemas.microsoft.com/office/word/2018/wordml/cex" xmlns:w16cid="http://schemas.microsoft.com/office/word/2016/wordml/cid" xmlns:w16="http://schemas.microsoft.com/office/word/2018/wordml" xmlns:w16du="http://schemas.microsoft.com/office/word/2023/wordml/word16du" xmlns:w16sdtdh="http://schemas.microsoft.com/office/word/2020/wordml/sdtdatahash" xmlns:w16sdtfl="http://schemas.microsoft.com/office/word/2024/wordml/sdtformatlock" xmlns:w16se="http://schemas.microsoft.com/office/word/2015/wordml/symex" xmlns:wpg="http://schemas.microsoft.com/office/word/2010/wordprocessingGroup" xmlns:wpi="http://schemas.microsoft.com/office/word/2010/wordprocessingInk" xmlns:wne="http://schemas.microsoft.com/office/word/2006/wordml" xmlns:wps="http://schemas.microsoft.com/office/word/2010/wordprocessingShape" mc:Ignorable="w14 w15 w16se w16cid w16 w16cex w16sdtdh w16sdtfl w16du wp14">
   <w:body>
     <w:p>
       <w:pPr>
@@ -51,27 +51,24 @@
       </w:r>
     </w:p>
     <w:p>
-      <w:r>
-        <w:t xml:space="preserve">By </w:t>
-      </w:r>
-      <w:r>
+      <w:pPr>
         <w:rPr>
-          <w:sz w:val="24"/>
+          <w:i/>
+          <w:iCs/>
+          <w:color w:val="767171" w:themeColor="background2" w:themeShade="80"/>
+          <w:sz w:val="16"/>
+          <w:szCs w:val="16"/>
         </w:rPr>
-        <w:t>Mo Mohammed</w:t>
-      </w:r>
-    </w:p>
-    <w:p/>
-    <w:p>
-      <w:pPr>
-        <w:jc w:val="center"/>
       </w:pPr>
       <w:r>
         <w:rPr>
-          <w:color w:val="374151"/>
-          <w:sz w:val="32"/>
+          <w:i/>
+          <w:iCs/>
+          <w:color w:val="767171" w:themeColor="background2" w:themeShade="80"/>
+          <w:sz w:val="16"/>
+          <w:szCs w:val="16"/>
         </w:rPr>
-        <w:t>Unity Portfolio Project Foundation Document</w:t>
+        <w:t>By Mo Mohammed</w:t>
       </w:r>
     </w:p>
     <w:p>
@@ -83,9 +80,15 @@
         <w:t>Purpose: Build a modular, professional character controller showcase for GitHub and portfolio presentation</w:t>
       </w:r>
     </w:p>
-    <w:p/>
     <w:sdt>
       <w:sdtPr>
+        <w:rPr>
+          <w:caps w:val="0"/>
+          <w:color w:val="auto"/>
+          <w:spacing w:val="0"/>
+          <w:sz w:val="20"/>
+          <w:szCs w:val="20"/>
+        </w:rPr>
         <w:id w:val="857075319"/>
         <w:docPartObj>
           <w:docPartGallery w:val="Table of Contents"/>
@@ -96,12 +99,7 @@
         <w:rPr>
           <w:b/>
           <w:bCs/>
-          <w:caps w:val="0"/>
           <w:noProof/>
-          <w:color w:val="auto"/>
-          <w:spacing w:val="0"/>
-          <w:sz w:val="20"/>
-          <w:szCs w:val="20"/>
         </w:rPr>
       </w:sdtEndPr>
       <w:sdtContent>
@@ -400,21 +398,7 @@
                 <w:rStyle w:val="Hyperlink"/>
                 <w:noProof/>
               </w:rPr>
-              <w:t xml:space="preserve">1.3 Design </w:t>
-            </w:r>
-            <w:r>
-              <w:rPr>
-                <w:rStyle w:val="Hyperlink"/>
-                <w:noProof/>
-              </w:rPr>
-              <w:t>p</w:t>
-            </w:r>
-            <w:r>
-              <w:rPr>
-                <w:rStyle w:val="Hyperlink"/>
-                <w:noProof/>
-              </w:rPr>
-              <w:t>illars</w:t>
+              <w:t>1.3 Design pillars</w:t>
             </w:r>
             <w:r>
               <w:rPr>
@@ -998,7 +982,21 @@
                 <w:rStyle w:val="Hyperlink"/>
                 <w:noProof/>
               </w:rPr>
-              <w:t>2.3 Input plan</w:t>
+              <w:t>2.3 Inpu</w:t>
+            </w:r>
+            <w:r>
+              <w:rPr>
+                <w:rStyle w:val="Hyperlink"/>
+                <w:noProof/>
+              </w:rPr>
+              <w:t>t</w:t>
+            </w:r>
+            <w:r>
+              <w:rPr>
+                <w:rStyle w:val="Hyperlink"/>
+                <w:noProof/>
+              </w:rPr>
+              <w:t xml:space="preserve"> plan</w:t>
             </w:r>
             <w:r>
               <w:rPr>
@@ -1615,13 +1613,7 @@
     </w:p>
     <w:p>
       <w:r>
-        <w:t>Th</w:t>
-      </w:r>
-      <w:r>
-        <w:t>is</w:t>
-      </w:r>
-      <w:r>
-        <w:t xml:space="preserve"> Advanced Character Controller is a Unity gameplay programming project designed to showcase strong player movement, clean code structure, and scalable gameplay architecture. The project does not need to become a full game. Its purpose is to prove that the controller can support real production-style mechanics and can be expanded into an action RPG, adventure game, platformer, or open-world traversal prototype.</w:t>
+        <w:t>This Advanced Character Controller is a Unity gameplay programming project designed to showcase strong player movement, clean code structure, and scalable gameplay architecture. The project does not need to become a full game. Its purpose is to prove that the controller can support real production-style mechanics and can be expanded into an action RPG, adventure game, platformer, or open-world traversal prototype.</w:t>
       </w:r>
     </w:p>
     <w:p>
@@ -1763,10 +1755,7 @@
           <w:p>
             <w:proofErr w:type="gramStart"/>
             <w:r>
-              <w:t>Third-perso</w:t>
-            </w:r>
-            <w:r>
-              <w:t>n</w:t>
+              <w:t>Third-person</w:t>
             </w:r>
             <w:proofErr w:type="gramEnd"/>
             <w:r>
@@ -1823,13 +1812,7 @@
     </w:p>
     <w:p>
       <w:r>
-        <w:t xml:space="preserve">This project should communicate that </w:t>
-      </w:r>
-      <w:r>
-        <w:t xml:space="preserve">I </w:t>
-      </w:r>
-      <w:r>
-        <w:t>understand how to turn input into polished player action. The project should avoid looking like a basic tutorial controller. Instead, it should show thoughtful design, strong debugging tools, and professional presentation.</w:t>
+        <w:t>This project should communicate that I understand how to turn input into polished player action. The project should avoid looking like a basic tutorial controller. Instead, it should show thoughtful design, strong debugging tools, and professional presentation.</w:t>
       </w:r>
     </w:p>
     <w:p>
@@ -1870,6 +1853,172 @@
     </w:p>
     <w:p>
       <w:pPr>
+        <w:pStyle w:val="Heading2"/>
+      </w:pPr>
+      <w:bookmarkStart w:id="3" w:name="_Toc231045661"/>
+      <w:r>
+        <w:t>1.3 Design pillars</w:t>
+      </w:r>
+      <w:bookmarkEnd w:id="3"/>
+    </w:p>
+    <w:p>
+      <w:pPr>
+        <w:pStyle w:val="ListParagraph"/>
+        <w:numPr>
+          <w:ilvl w:val="0"/>
+          <w:numId w:val="3"/>
+        </w:numPr>
+      </w:pPr>
+      <w:r>
+        <w:rPr>
+          <w:b/>
+        </w:rPr>
+        <w:t xml:space="preserve">Responsive: </w:t>
+      </w:r>
+      <w:r>
+        <w:t xml:space="preserve">The player should feel like their </w:t>
+      </w:r>
+      <w:proofErr w:type="gramStart"/>
+      <w:r>
+        <w:t>inputs are</w:t>
+      </w:r>
+      <w:proofErr w:type="gramEnd"/>
+      <w:r>
+        <w:t xml:space="preserve"> being respected. Movement should start, stop, turn, jump, and dash with clear timing and predictable behavior.</w:t>
+      </w:r>
+    </w:p>
+    <w:p>
+      <w:pPr>
+        <w:pStyle w:val="ListParagraph"/>
+      </w:pPr>
+    </w:p>
+    <w:p>
+      <w:pPr>
+        <w:pStyle w:val="ListParagraph"/>
+        <w:numPr>
+          <w:ilvl w:val="0"/>
+          <w:numId w:val="3"/>
+        </w:numPr>
+      </w:pPr>
+      <w:r>
+        <w:rPr>
+          <w:b/>
+        </w:rPr>
+        <w:t xml:space="preserve">Modular: </w:t>
+      </w:r>
+      <w:proofErr w:type="gramStart"/>
+      <w:r>
+        <w:t>Each movement</w:t>
+      </w:r>
+      <w:proofErr w:type="gramEnd"/>
+      <w:r>
+        <w:t xml:space="preserve"> behavior should be separated into its own state or system so new features can be added without rewriting the entire controller.</w:t>
+      </w:r>
+    </w:p>
+    <w:p>
+      <w:pPr>
+        <w:pStyle w:val="ListParagraph"/>
+      </w:pPr>
+    </w:p>
+    <w:p>
+      <w:pPr>
+        <w:pStyle w:val="ListParagraph"/>
+        <w:numPr>
+          <w:ilvl w:val="0"/>
+          <w:numId w:val="3"/>
+        </w:numPr>
+      </w:pPr>
+      <w:r>
+        <w:rPr>
+          <w:b/>
+        </w:rPr>
+        <w:lastRenderedPageBreak/>
+        <w:t xml:space="preserve">Readable: </w:t>
+      </w:r>
+      <w:r>
+        <w:t>The codebase should be understandable to another programmer. Names, folders, comments, and debug tools should make the project easy to review.</w:t>
+      </w:r>
+    </w:p>
+    <w:p>
+      <w:pPr>
+        <w:pStyle w:val="ListParagraph"/>
+      </w:pPr>
+    </w:p>
+    <w:p>
+      <w:pPr>
+        <w:pStyle w:val="ListParagraph"/>
+        <w:numPr>
+          <w:ilvl w:val="0"/>
+          <w:numId w:val="3"/>
+        </w:numPr>
+      </w:pPr>
+      <w:r>
+        <w:rPr>
+          <w:b/>
+        </w:rPr>
+        <w:t xml:space="preserve">Expandable: </w:t>
+      </w:r>
+      <w:r>
+        <w:t>The controller should be built in a way that can later support combat, climbing, swimming, gliding, parkour, lock-on, or multiplayer adaptation.</w:t>
+      </w:r>
+    </w:p>
+    <w:p>
+      <w:pPr>
+        <w:pStyle w:val="ListParagraph"/>
+      </w:pPr>
+    </w:p>
+    <w:p>
+      <w:pPr>
+        <w:pStyle w:val="ListParagraph"/>
+        <w:numPr>
+          <w:ilvl w:val="0"/>
+          <w:numId w:val="3"/>
+        </w:numPr>
+      </w:pPr>
+      <w:r>
+        <w:rPr>
+          <w:b/>
+        </w:rPr>
+        <w:t xml:space="preserve">Portfolio-Ready: </w:t>
+      </w:r>
+      <w:r>
+        <w:t>The final demo should include a test scene, video footage, screenshots, README, and a short technical breakdown.</w:t>
+      </w:r>
+    </w:p>
+    <w:p/>
+    <w:p>
+      <w:pPr>
+        <w:pStyle w:val="Heading1"/>
+      </w:pPr>
+      <w:bookmarkStart w:id="4" w:name="_Toc231045662"/>
+      <w:r>
+        <w:t>2. Complete features</w:t>
+      </w:r>
+      <w:bookmarkEnd w:id="4"/>
+    </w:p>
+    <w:p/>
+    <w:p>
+      <w:pPr>
+        <w:pStyle w:val="Heading2"/>
+      </w:pPr>
+      <w:bookmarkStart w:id="5" w:name="_Toc231045663"/>
+      <w:r>
+        <w:t>2.1 Core Feature Set</w:t>
+      </w:r>
+      <w:bookmarkEnd w:id="5"/>
+    </w:p>
+    <w:p>
+      <w:pPr>
+        <w:pStyle w:val="Heading3"/>
+      </w:pPr>
+      <w:bookmarkStart w:id="6" w:name="_Toc231045664"/>
+      <w:r>
+        <w:t>2.11 Ground movement</w:t>
+      </w:r>
+      <w:bookmarkEnd w:id="6"/>
+    </w:p>
+    <w:p>
+      <w:pPr>
         <w:pStyle w:val="ListBullet"/>
         <w:tabs>
           <w:tab w:val="num" w:pos="360"/>
@@ -1877,175 +2026,8 @@
         <w:ind w:left="360" w:hanging="360"/>
       </w:pPr>
       <w:r>
-        <w:t>Create a project that can be explained clearly on a portfolio website and GitHub README.</w:t>
-      </w:r>
-    </w:p>
-    <w:p/>
-    <w:p>
-      <w:pPr>
-        <w:pStyle w:val="Heading2"/>
-      </w:pPr>
-      <w:bookmarkStart w:id="3" w:name="_Toc231045661"/>
-      <w:r>
-        <w:t>1.3 Design pillars</w:t>
-      </w:r>
-      <w:bookmarkEnd w:id="3"/>
-    </w:p>
-    <w:p>
-      <w:pPr>
-        <w:pStyle w:val="ListParagraph"/>
-        <w:numPr>
-          <w:ilvl w:val="0"/>
-          <w:numId w:val="3"/>
-        </w:numPr>
-      </w:pPr>
-      <w:r>
-        <w:rPr>
-          <w:b/>
-        </w:rPr>
-        <w:t xml:space="preserve">Responsive: </w:t>
-      </w:r>
-      <w:r>
-        <w:t xml:space="preserve">The player should feel like their </w:t>
-      </w:r>
-      <w:proofErr w:type="gramStart"/>
-      <w:r>
-        <w:t>inputs are</w:t>
-      </w:r>
-      <w:proofErr w:type="gramEnd"/>
-      <w:r>
-        <w:t xml:space="preserve"> being respected. Movement should start, stop, turn, jump, and dash with clear timing and predictable behavior.</w:t>
-      </w:r>
-    </w:p>
-    <w:p>
-      <w:pPr>
-        <w:pStyle w:val="ListParagraph"/>
-      </w:pPr>
-    </w:p>
-    <w:p>
-      <w:pPr>
-        <w:pStyle w:val="ListParagraph"/>
-        <w:numPr>
-          <w:ilvl w:val="0"/>
-          <w:numId w:val="3"/>
-        </w:numPr>
-      </w:pPr>
-      <w:r>
-        <w:rPr>
-          <w:b/>
-        </w:rPr>
-        <w:lastRenderedPageBreak/>
-        <w:t xml:space="preserve">Modular: </w:t>
-      </w:r>
-      <w:proofErr w:type="gramStart"/>
-      <w:r>
-        <w:t>Each movement</w:t>
-      </w:r>
-      <w:proofErr w:type="gramEnd"/>
-      <w:r>
-        <w:t xml:space="preserve"> behavior should be separated into its own state or system so new features can be added without rewriting the entire controller.</w:t>
-      </w:r>
-    </w:p>
-    <w:p>
-      <w:pPr>
-        <w:pStyle w:val="ListParagraph"/>
-      </w:pPr>
-    </w:p>
-    <w:p>
-      <w:pPr>
-        <w:pStyle w:val="ListParagraph"/>
-        <w:numPr>
-          <w:ilvl w:val="0"/>
-          <w:numId w:val="3"/>
-        </w:numPr>
-      </w:pPr>
-      <w:r>
-        <w:rPr>
-          <w:b/>
-        </w:rPr>
-        <w:t xml:space="preserve">Readable: </w:t>
-      </w:r>
-      <w:r>
-        <w:t>The codebase should be understandable to another programmer. Names, folders, comments, and debug tools should make the project easy to review.</w:t>
-      </w:r>
-    </w:p>
-    <w:p>
-      <w:pPr>
-        <w:pStyle w:val="ListParagraph"/>
-      </w:pPr>
-    </w:p>
-    <w:p>
-      <w:pPr>
-        <w:pStyle w:val="ListParagraph"/>
-        <w:numPr>
-          <w:ilvl w:val="0"/>
-          <w:numId w:val="3"/>
-        </w:numPr>
-      </w:pPr>
-      <w:r>
-        <w:rPr>
-          <w:b/>
-        </w:rPr>
-        <w:t xml:space="preserve">Expandable: </w:t>
-      </w:r>
-      <w:r>
-        <w:t>The controller should be built in a way that can later support combat, climbing, swimming, gliding, parkour, lock-on, or multiplayer adaptation.</w:t>
-      </w:r>
-    </w:p>
-    <w:p>
-      <w:pPr>
-        <w:pStyle w:val="ListParagraph"/>
-      </w:pPr>
-    </w:p>
-    <w:p>
-      <w:pPr>
-        <w:pStyle w:val="ListParagraph"/>
-        <w:numPr>
-          <w:ilvl w:val="0"/>
-          <w:numId w:val="3"/>
-        </w:numPr>
-      </w:pPr>
-      <w:r>
-        <w:rPr>
-          <w:b/>
-        </w:rPr>
-        <w:t xml:space="preserve">Portfolio-Ready: </w:t>
-      </w:r>
-      <w:r>
-        <w:t>The final demo should include a test scene, video footage, screenshots, README, and a short technical breakdown.</w:t>
-      </w:r>
-    </w:p>
-    <w:p/>
-    <w:p>
-      <w:pPr>
-        <w:pStyle w:val="Heading1"/>
-      </w:pPr>
-      <w:bookmarkStart w:id="4" w:name="_Toc231045662"/>
-      <w:r>
-        <w:t>2. Complete features</w:t>
-      </w:r>
-      <w:bookmarkEnd w:id="4"/>
-    </w:p>
-    <w:p/>
-    <w:p>
-      <w:pPr>
-        <w:pStyle w:val="Heading2"/>
-      </w:pPr>
-      <w:bookmarkStart w:id="5" w:name="_Toc231045663"/>
-      <w:r>
-        <w:t>2.1 Core Feature Set</w:t>
-      </w:r>
-      <w:bookmarkEnd w:id="5"/>
-    </w:p>
-    <w:p>
-      <w:pPr>
-        <w:pStyle w:val="Heading3"/>
-      </w:pPr>
-      <w:bookmarkStart w:id="6" w:name="_Toc231045664"/>
-      <w:r>
-        <w:t>2.11 Ground movement</w:t>
-      </w:r>
-      <w:bookmarkEnd w:id="6"/>
+        <w:t>Idle, walk, run, and sprint states.</w:t>
+      </w:r>
     </w:p>
     <w:p>
       <w:pPr>
@@ -2056,7 +2038,7 @@
         <w:ind w:left="360" w:hanging="360"/>
       </w:pPr>
       <w:r>
-        <w:t>Idle, walk, run, and sprint states.</w:t>
+        <w:t>Camera-relative movement direction.</w:t>
       </w:r>
     </w:p>
     <w:p>
@@ -2068,7 +2050,7 @@
         <w:ind w:left="360" w:hanging="360"/>
       </w:pPr>
       <w:r>
-        <w:t>Camera-relative movement direction.</w:t>
+        <w:t>Smooth acceleration and deceleration.</w:t>
       </w:r>
     </w:p>
     <w:p>
@@ -2080,7 +2062,7 @@
         <w:ind w:left="360" w:hanging="360"/>
       </w:pPr>
       <w:r>
-        <w:t>Smooth acceleration and deceleration.</w:t>
+        <w:t>Rotation smoothing toward movement direction.</w:t>
       </w:r>
     </w:p>
     <w:p>
@@ -2092,7 +2074,7 @@
         <w:ind w:left="360" w:hanging="360"/>
       </w:pPr>
       <w:r>
-        <w:t>Rotation smoothing toward movement direction.</w:t>
+        <w:t>Slope detection and grounded movement correction.</w:t>
       </w:r>
     </w:p>
     <w:p>
@@ -2104,8 +2086,18 @@
         <w:ind w:left="360" w:hanging="360"/>
       </w:pPr>
       <w:r>
-        <w:t>Slope detection and grounded movement correction.</w:t>
-      </w:r>
+        <w:t>Optional movement speed modifiers for future buffs, debuffs, or terrain effects.</w:t>
+      </w:r>
+    </w:p>
+    <w:p>
+      <w:pPr>
+        <w:pStyle w:val="Heading3"/>
+      </w:pPr>
+      <w:bookmarkStart w:id="7" w:name="_Toc231045665"/>
+      <w:r>
+        <w:t>2.12 jumping and air control</w:t>
+      </w:r>
+      <w:bookmarkEnd w:id="7"/>
     </w:p>
     <w:p>
       <w:pPr>
@@ -2116,18 +2108,8 @@
         <w:ind w:left="360" w:hanging="360"/>
       </w:pPr>
       <w:r>
-        <w:t>Optional movement speed modifiers for future buffs, debuffs, or terrain effects.</w:t>
-      </w:r>
-    </w:p>
-    <w:p>
-      <w:pPr>
-        <w:pStyle w:val="Heading3"/>
-      </w:pPr>
-      <w:bookmarkStart w:id="7" w:name="_Toc231045665"/>
-      <w:r>
-        <w:t>2.12 jumping and air control</w:t>
-      </w:r>
-      <w:bookmarkEnd w:id="7"/>
+        <w:t>Jump start, rising, falling, and landing behavior.</w:t>
+      </w:r>
     </w:p>
     <w:p>
       <w:pPr>
@@ -2138,7 +2120,7 @@
         <w:ind w:left="360" w:hanging="360"/>
       </w:pPr>
       <w:r>
-        <w:t>Jump start, rising, falling, and landing behavior.</w:t>
+        <w:t>Coyote time to allow jumps shortly after leaving a platform.</w:t>
       </w:r>
     </w:p>
     <w:p>
@@ -2150,7 +2132,10 @@
         <w:ind w:left="360" w:hanging="360"/>
       </w:pPr>
       <w:r>
-        <w:t>Coyote time to allow jumps shortly after leaving a platform.</w:t>
+        <w:t xml:space="preserve">Jump buffering to allow jump input slightly before </w:t>
+      </w:r>
+      <w:r>
+        <w:t>landing.</w:t>
       </w:r>
     </w:p>
     <w:p>
@@ -2162,11 +2147,18 @@
         <w:ind w:left="360" w:hanging="360"/>
       </w:pPr>
       <w:r>
-        <w:t xml:space="preserve">Jump buffering to allow jump input slightly before </w:t>
-      </w:r>
-      <w:r>
-        <w:t>landing.</w:t>
-      </w:r>
+        <w:t>Air control values that can be tuned separately from grounded movement.</w:t>
+      </w:r>
+    </w:p>
+    <w:p>
+      <w:pPr>
+        <w:pStyle w:val="Heading3"/>
+      </w:pPr>
+      <w:bookmarkStart w:id="8" w:name="_Toc231045666"/>
+      <w:r>
+        <w:t>2.13 stamina based traversal</w:t>
+      </w:r>
+      <w:bookmarkEnd w:id="8"/>
     </w:p>
     <w:p>
       <w:pPr>
@@ -2177,18 +2169,8 @@
         <w:ind w:left="360" w:hanging="360"/>
       </w:pPr>
       <w:r>
-        <w:t>Air control values that can be tuned separately from grounded movement.</w:t>
-      </w:r>
-    </w:p>
-    <w:p>
-      <w:pPr>
-        <w:pStyle w:val="Heading3"/>
-      </w:pPr>
-      <w:bookmarkStart w:id="8" w:name="_Toc231045666"/>
-      <w:r>
-        <w:t>2.13 stamina based traversal</w:t>
-      </w:r>
-      <w:bookmarkEnd w:id="8"/>
+        <w:t>Stamina drains during sprinting and dash/dodge actions.</w:t>
+      </w:r>
     </w:p>
     <w:p>
       <w:pPr>
@@ -2199,7 +2181,7 @@
         <w:ind w:left="360" w:hanging="360"/>
       </w:pPr>
       <w:r>
-        <w:t>Stamina drains during sprinting and dash/dodge actions.</w:t>
+        <w:t>Stamina regenerates after a short delay when not being consumed.</w:t>
       </w:r>
     </w:p>
     <w:p>
@@ -2211,7 +2193,7 @@
         <w:ind w:left="360" w:hanging="360"/>
       </w:pPr>
       <w:r>
-        <w:t>Stamina regenerates after a short delay when not being consumed.</w:t>
+        <w:t>Actions can be blocked when stamina is too low.</w:t>
       </w:r>
     </w:p>
     <w:p>
@@ -2223,7 +2205,7 @@
         <w:ind w:left="360" w:hanging="360"/>
       </w:pPr>
       <w:r>
-        <w:t>Actions can be blocked when stamina is too low.</w:t>
+        <w:t>UI feedback should make stamina costs and restrictions clear.</w:t>
       </w:r>
     </w:p>
     <w:p>
@@ -2235,8 +2217,18 @@
         <w:ind w:left="360" w:hanging="360"/>
       </w:pPr>
       <w:r>
-        <w:t>UI feedback should make stamina costs and restrictions clear.</w:t>
-      </w:r>
+        <w:t>System should be expandable for climbing, gliding, swimming, or combat stamina later.</w:t>
+      </w:r>
+    </w:p>
+    <w:p>
+      <w:pPr>
+        <w:pStyle w:val="Heading3"/>
+      </w:pPr>
+      <w:bookmarkStart w:id="9" w:name="_Toc231045667"/>
+      <w:r>
+        <w:t>2.14 advanced traversal</w:t>
+      </w:r>
+      <w:bookmarkEnd w:id="9"/>
     </w:p>
     <w:p>
       <w:pPr>
@@ -2247,42 +2239,44 @@
         <w:ind w:left="360" w:hanging="360"/>
       </w:pPr>
       <w:r>
-        <w:t>System should be expandable for climbing, gliding, swimming, or combat stamina later.</w:t>
-      </w:r>
-    </w:p>
-    <w:p>
-      <w:pPr>
-        <w:pStyle w:val="Heading3"/>
-      </w:pPr>
-      <w:bookmarkStart w:id="9" w:name="_Toc231045667"/>
-      <w:r>
-        <w:t>2.14 advanced traversal</w:t>
-      </w:r>
-      <w:bookmarkEnd w:id="9"/>
+        <w:t>Dash or dodge with cooldown, stamina cost, and cancel rules.</w:t>
+      </w:r>
     </w:p>
     <w:p>
       <w:pPr>
         <w:pStyle w:val="ListBullet"/>
-        <w:tabs>
-          <w:tab w:val="num" w:pos="360"/>
-        </w:tabs>
-        <w:ind w:left="360" w:hanging="360"/>
-      </w:pPr>
-      <w:r>
-        <w:t>Dash or dodge with cooldown, stamina cost, and cancel rules.</w:t>
-      </w:r>
+        <w:numPr>
+          <w:ilvl w:val="0"/>
+          <w:numId w:val="0"/>
+        </w:numPr>
+      </w:pPr>
     </w:p>
     <w:p>
       <w:pPr>
         <w:pStyle w:val="ListBullet"/>
-        <w:tabs>
-          <w:tab w:val="num" w:pos="360"/>
-        </w:tabs>
-        <w:ind w:left="360" w:hanging="360"/>
-      </w:pPr>
-      <w:r>
-        <w:t>Wall jump direction based on wall normal and player input.</w:t>
-      </w:r>
+        <w:numPr>
+          <w:ilvl w:val="0"/>
+          <w:numId w:val="0"/>
+        </w:numPr>
+      </w:pPr>
+    </w:p>
+    <w:p>
+      <w:pPr>
+        <w:pStyle w:val="ListBullet"/>
+        <w:numPr>
+          <w:ilvl w:val="0"/>
+          <w:numId w:val="0"/>
+        </w:numPr>
+      </w:pPr>
+    </w:p>
+    <w:p>
+      <w:pPr>
+        <w:pStyle w:val="ListBullet"/>
+        <w:numPr>
+          <w:ilvl w:val="0"/>
+          <w:numId w:val="0"/>
+        </w:numPr>
+      </w:pPr>
     </w:p>
     <w:p>
       <w:pPr>
@@ -2723,7 +2717,7 @@
               <w:rPr>
                 <w:b/>
               </w:rPr>
-              <w:t>Wall Jump</w:t>
+              <w:t>Land</w:t>
             </w:r>
           </w:p>
         </w:tc>
@@ -2733,15 +2727,7 @@
           </w:tcPr>
           <w:p>
             <w:r>
-              <w:t xml:space="preserve">Player jumps away from </w:t>
-            </w:r>
-            <w:proofErr w:type="gramStart"/>
-            <w:r>
-              <w:t>a wall</w:t>
-            </w:r>
-            <w:proofErr w:type="gramEnd"/>
-            <w:r>
-              <w:t>.</w:t>
+              <w:t>Short landing state for impact handling.</w:t>
             </w:r>
           </w:p>
         </w:tc>
@@ -2751,7 +2737,7 @@
           </w:tcPr>
           <w:p>
             <w:r>
-              <w:t>Rising, Fall</w:t>
+              <w:t>Idle, Walk, Run</w:t>
             </w:r>
           </w:p>
         </w:tc>
@@ -2764,34 +2750,19 @@
           <w:tcPr>
             <w:tcW w:w="3077" w:type="dxa"/>
           </w:tcPr>
-          <w:p>
-            <w:r>
-              <w:rPr>
-                <w:b/>
-              </w:rPr>
-              <w:t>Land</w:t>
-            </w:r>
-          </w:p>
+          <w:p/>
         </w:tc>
         <w:tc>
           <w:tcPr>
             <w:tcW w:w="3131" w:type="dxa"/>
           </w:tcPr>
-          <w:p>
-            <w:r>
-              <w:t>Short landing state for impact handling.</w:t>
-            </w:r>
-          </w:p>
+          <w:p/>
         </w:tc>
         <w:tc>
           <w:tcPr>
             <w:tcW w:w="3136" w:type="dxa"/>
           </w:tcPr>
-          <w:p>
-            <w:r>
-              <w:t>Idle, Walk, Run</w:t>
-            </w:r>
-          </w:p>
+          <w:p/>
         </w:tc>
       </w:tr>
     </w:tbl>
@@ -3136,13 +3107,7 @@
           </w:tcPr>
           <w:p>
             <w:r>
-              <w:t>Pressed</w:t>
-            </w:r>
-            <w:r>
-              <w:t xml:space="preserve"> </w:t>
-            </w:r>
-            <w:r>
-              <w:t>for jump buffer and jump height.</w:t>
+              <w:t>Pressed for jump buffer and jump height.</w:t>
             </w:r>
           </w:p>
           <w:p/>
@@ -4025,7 +3990,7 @@
         </w:trPr>
         <w:tc>
           <w:tcPr>
-            <w:tcW w:w="5040" w:type="dxa"/>
+            <w:tcW w:w="4673" w:type="dxa"/>
             <w:shd w:val="clear" w:color="auto" w:fill="1F2937"/>
           </w:tcPr>
           <w:p>
@@ -4040,7 +4005,7 @@
         </w:tc>
         <w:tc>
           <w:tcPr>
-            <w:tcW w:w="5040" w:type="dxa"/>
+            <w:tcW w:w="4687" w:type="dxa"/>
             <w:shd w:val="clear" w:color="auto" w:fill="1F2937"/>
           </w:tcPr>
           <w:p>
@@ -4060,7 +4025,7 @@
         </w:trPr>
         <w:tc>
           <w:tcPr>
-            <w:tcW w:w="5040" w:type="dxa"/>
+            <w:tcW w:w="4673" w:type="dxa"/>
           </w:tcPr>
           <w:p>
             <w:r>
@@ -4073,7 +4038,7 @@
         </w:tc>
         <w:tc>
           <w:tcPr>
-            <w:tcW w:w="5040" w:type="dxa"/>
+            <w:tcW w:w="4687" w:type="dxa"/>
           </w:tcPr>
           <w:p>
             <w:r>
@@ -4096,7 +4061,7 @@
         </w:trPr>
         <w:tc>
           <w:tcPr>
-            <w:tcW w:w="5040" w:type="dxa"/>
+            <w:tcW w:w="4673" w:type="dxa"/>
           </w:tcPr>
           <w:p>
             <w:r>
@@ -4109,7 +4074,7 @@
         </w:tc>
         <w:tc>
           <w:tcPr>
-            <w:tcW w:w="5040" w:type="dxa"/>
+            <w:tcW w:w="4687" w:type="dxa"/>
           </w:tcPr>
           <w:p>
             <w:r>
@@ -4124,7 +4089,7 @@
         </w:trPr>
         <w:tc>
           <w:tcPr>
-            <w:tcW w:w="5040" w:type="dxa"/>
+            <w:tcW w:w="4673" w:type="dxa"/>
           </w:tcPr>
           <w:p>
             <w:r>
@@ -4137,7 +4102,7 @@
         </w:tc>
         <w:tc>
           <w:tcPr>
-            <w:tcW w:w="5040" w:type="dxa"/>
+            <w:tcW w:w="4687" w:type="dxa"/>
           </w:tcPr>
           <w:p>
             <w:r>
@@ -4152,7 +4117,7 @@
         </w:trPr>
         <w:tc>
           <w:tcPr>
-            <w:tcW w:w="5040" w:type="dxa"/>
+            <w:tcW w:w="4673" w:type="dxa"/>
           </w:tcPr>
           <w:p>
             <w:r>
@@ -4165,7 +4130,7 @@
         </w:tc>
         <w:tc>
           <w:tcPr>
-            <w:tcW w:w="5040" w:type="dxa"/>
+            <w:tcW w:w="4687" w:type="dxa"/>
           </w:tcPr>
           <w:p>
             <w:r>
@@ -4180,7 +4145,7 @@
         </w:trPr>
         <w:tc>
           <w:tcPr>
-            <w:tcW w:w="5040" w:type="dxa"/>
+            <w:tcW w:w="4673" w:type="dxa"/>
           </w:tcPr>
           <w:p>
             <w:r>
@@ -4193,7 +4158,7 @@
         </w:tc>
         <w:tc>
           <w:tcPr>
-            <w:tcW w:w="5040" w:type="dxa"/>
+            <w:tcW w:w="4687" w:type="dxa"/>
           </w:tcPr>
           <w:p>
             <w:r>
@@ -4208,7 +4173,7 @@
         </w:trPr>
         <w:tc>
           <w:tcPr>
-            <w:tcW w:w="5040" w:type="dxa"/>
+            <w:tcW w:w="4673" w:type="dxa"/>
           </w:tcPr>
           <w:p>
             <w:r>
@@ -4216,23 +4181,17 @@
                 <w:b/>
               </w:rPr>
               <w:lastRenderedPageBreak/>
-              <w:t xml:space="preserve">Is Wall </w:t>
-            </w:r>
-            <w:r>
-              <w:rPr>
-                <w:b/>
-              </w:rPr>
-              <w:t>Jumping</w:t>
-            </w:r>
-          </w:p>
-        </w:tc>
-        <w:tc>
-          <w:tcPr>
-            <w:tcW w:w="5040" w:type="dxa"/>
-          </w:tcPr>
-          <w:p>
-            <w:r>
-              <w:t>Bool used for wall slide animation.</w:t>
+              <w:t>Landed</w:t>
+            </w:r>
+          </w:p>
+        </w:tc>
+        <w:tc>
+          <w:tcPr>
+            <w:tcW w:w="4687" w:type="dxa"/>
+          </w:tcPr>
+          <w:p>
+            <w:r>
+              <w:t>Trigger used for landing impact animation.</w:t>
             </w:r>
           </w:p>
         </w:tc>
@@ -4243,26 +4202,15 @@
         </w:trPr>
         <w:tc>
           <w:tcPr>
-            <w:tcW w:w="5040" w:type="dxa"/>
-          </w:tcPr>
-          <w:p>
-            <w:r>
-              <w:rPr>
-                <w:b/>
-              </w:rPr>
-              <w:t>Landed</w:t>
-            </w:r>
-          </w:p>
-        </w:tc>
-        <w:tc>
-          <w:tcPr>
-            <w:tcW w:w="5040" w:type="dxa"/>
-          </w:tcPr>
-          <w:p>
-            <w:r>
-              <w:t>Trigger used for landing impact animation.</w:t>
-            </w:r>
-          </w:p>
+            <w:tcW w:w="4673" w:type="dxa"/>
+          </w:tcPr>
+          <w:p/>
+        </w:tc>
+        <w:tc>
+          <w:tcPr>
+            <w:tcW w:w="4687" w:type="dxa"/>
+          </w:tcPr>
+          <w:p/>
         </w:tc>
       </w:tr>
     </w:tbl>
@@ -4685,7 +4633,7 @@
 </file>
 
 <file path=word/endnotes.xml><?xml version="1.0" encoding="utf-8"?>
-<w:endnotes xmlns:wpc="http://schemas.microsoft.com/office/word/2010/wordprocessingCanvas" xmlns:cx="http://schemas.microsoft.com/office/drawing/2014/chartex" xmlns:cx1="http://schemas.microsoft.com/office/drawing/2015/9/8/chartex" xmlns:cx2="http://schemas.microsoft.com/office/drawing/2015/10/21/chartex" xmlns:cx3="http://schemas.microsoft.com/office/drawing/2016/5/9/chartex" xmlns:cx4="http://schemas.microsoft.com/office/drawing/2016/5/10/chartex" xmlns:cx5="http://schemas.microsoft.com/office/drawing/2016/5/11/chartex" xmlns:cx6="http://schemas.microsoft.com/office/drawing/2016/5/12/chartex" xmlns:cx7="http://schemas.microsoft.com/office/drawing/2016/5/13/chartex" xmlns:cx8="http://schemas.microsoft.com/office/drawing/2016/5/14/chartex" xmlns:mc="http://schemas.openxmlformats.org/markup-compatibility/2006" xmlns:aink="http://schemas.microsoft.com/office/drawing/2016/ink" xmlns:am3d="http://schemas.microsoft.com/office/drawing/2017/model3d" xmlns:o="urn:schemas-microsoft-com:office:office" xmlns:oel="http://schemas.microsoft.com/office/2019/extlst" xmlns:r="http://schemas.openxmlformats.org/officeDocument/2006/relationships" xmlns:m="http://schemas.openxmlformats.org/officeDocument/2006/math" xmlns:v="urn:schemas-microsoft-com:vml" xmlns:wp14="http://schemas.microsoft.com/office/word/2010/wordprocessingDrawing" xmlns:wp="http://schemas.openxmlformats.org/drawingml/2006/wordprocessingDrawing" xmlns:w10="urn:schemas-microsoft-com:office:word" xmlns:w="http://schemas.openxmlformats.org/wordprocessingml/2006/main" xmlns:w14="http://schemas.microsoft.com/office/word/2010/wordml" xmlns:w15="http://schemas.microsoft.com/office/word/2012/wordml" xmlns:w16cex="http://schemas.microsoft.com/office/word/2018/wordml/cex" xmlns:w16cid="http://schemas.microsoft.com/office/word/2016/wordml/cid" xmlns:w16="http://schemas.microsoft.com/office/word/2018/wordml" xmlns:w16du="http://schemas.microsoft.com/office/word/2023/wordml/word16du" xmlns:w16sdtdh="http://schemas.microsoft.com/office/word/2020/wordml/sdtdatahash" xmlns:w16sdtfl="http://schemas.microsoft.com/office/word/2024/wordml/sdtformatlock" xmlns:w16se="http://schemas.microsoft.com/office/word/2015/wordml/symex" xmlns:wpg="http://schemas.microsoft.com/office/word/2010/wordprocessingGroup" xmlns:wpi="http://schemas.microsoft.com/office/word/2010/wordprocessingInk" xmlns:wne="http://schemas.microsoft.com/office/word/2006/wordml" xmlns:wps="http://schemas.microsoft.com/office/word/2010/wordprocessingShape" mc:Ignorable="w14 w15 w16se w16cid w16 w16cex w16sdtdh w16sdtfl w16du wp14">
+<w:endnotes xmlns:wpc="http://schemas.microsoft.com/office/word/2010/wordprocessingCanvas" xmlns:cx="http://schemas.microsoft.com/office/drawing/2014/chartex" xmlns:cx1="http://schemas.microsoft.com/office/drawing/2015/9/8/chartex" xmlns:cx2="http://schemas.microsoft.com/office/drawing/2015/10/21/chartex" xmlns:cx3="http://schemas.microsoft.com/office/drawing/2016/5/9/chartex" xmlns:cx4="http://schemas.microsoft.com/office/drawing/2016/5/10/chartex" xmlns:cx5="http://schemas.microsoft.com/office/drawing/2016/5/11/chartex" xmlns:cx6="http://schemas.microsoft.com/office/drawing/2016/5/12/chartex" xmlns:cx7="http://schemas.microsoft.com/office/drawing/2016/5/13/chartex" xmlns:cx8="http://schemas.microsoft.com/office/drawing/2016/5/14/chartex" xmlns:mc="http://schemas.openxmlformats.org/markup-compatibility/2006" xmlns:aink="http://schemas.microsoft.com/office/drawing/2016/ink" xmlns:am3d="http://schemas.microsoft.com/office/drawing/2017/model3d" xmlns:o="urn:schemas-microsoft-com:office:office" xmlns:oel="http://schemas.microsoft.com/office/2019/extlst" xmlns:r="http://schemas.openxmlformats.org/officeDocument/2006/relationships" xmlns:m="http://schemas.openxmlformats.org/officeDocument/2006/math" xmlns:v="urn:schemas-microsoft-com:vml" xmlns:wp14="http://schemas.microsoft.com/office/word/2010/wordprocessingDrawing" xmlns:wp="http://schemas.openxmlformats.org/drawingml/2006/wordprocessingDrawing" xmlns:w10="urn:schemas-microsoft-com:office:word" xmlns:w="http://schemas.openxmlformats.org/wordprocessingml/2006/main" xmlns:w14="http://schemas.microsoft.com/office/word/2010/wordml" xmlns:w15="http://schemas.microsoft.com/office/word/2012/wordml" xmlns:w16cei="http://schemas.microsoft.com/office/word/2026/wordml/cei" xmlns:w16cex="http://schemas.microsoft.com/office/word/2018/wordml/cex" xmlns:w16cid="http://schemas.microsoft.com/office/word/2016/wordml/cid" xmlns:w16="http://schemas.microsoft.com/office/word/2018/wordml" xmlns:w16du="http://schemas.microsoft.com/office/word/2023/wordml/word16du" xmlns:w16sdtdh="http://schemas.microsoft.com/office/word/2020/wordml/sdtdatahash" xmlns:w16sdtfl="http://schemas.microsoft.com/office/word/2024/wordml/sdtformatlock" xmlns:w16se="http://schemas.microsoft.com/office/word/2015/wordml/symex" xmlns:wpg="http://schemas.microsoft.com/office/word/2010/wordprocessingGroup" xmlns:wpi="http://schemas.microsoft.com/office/word/2010/wordprocessingInk" xmlns:wne="http://schemas.microsoft.com/office/word/2006/wordml" xmlns:wps="http://schemas.microsoft.com/office/word/2010/wordprocessingShape" mc:Ignorable="w14 w15 w16se w16cid w16 w16cex w16sdtdh w16sdtfl w16du wp14">
   <w:endnote w:type="separator" w:id="-1">
     <w:p>
       <w:pPr>
@@ -4710,7 +4658,7 @@
 </file>
 
 <file path=word/footer1.xml><?xml version="1.0" encoding="utf-8"?>
-<w:ftr xmlns:wpc="http://schemas.microsoft.com/office/word/2010/wordprocessingCanvas" xmlns:cx="http://schemas.microsoft.com/office/drawing/2014/chartex" xmlns:cx1="http://schemas.microsoft.com/office/drawing/2015/9/8/chartex" xmlns:cx2="http://schemas.microsoft.com/office/drawing/2015/10/21/chartex" xmlns:cx3="http://schemas.microsoft.com/office/drawing/2016/5/9/chartex" xmlns:cx4="http://schemas.microsoft.com/office/drawing/2016/5/10/chartex" xmlns:cx5="http://schemas.microsoft.com/office/drawing/2016/5/11/chartex" xmlns:cx6="http://schemas.microsoft.com/office/drawing/2016/5/12/chartex" xmlns:cx7="http://schemas.microsoft.com/office/drawing/2016/5/13/chartex" xmlns:cx8="http://schemas.microsoft.com/office/drawing/2016/5/14/chartex" xmlns:mc="http://schemas.openxmlformats.org/markup-compatibility/2006" xmlns:aink="http://schemas.microsoft.com/office/drawing/2016/ink" xmlns:am3d="http://schemas.microsoft.com/office/drawing/2017/model3d" xmlns:o="urn:schemas-microsoft-com:office:office" xmlns:oel="http://schemas.microsoft.com/office/2019/extlst" xmlns:r="http://schemas.openxmlformats.org/officeDocument/2006/relationships" xmlns:m="http://schemas.openxmlformats.org/officeDocument/2006/math" xmlns:v="urn:schemas-microsoft-com:vml" xmlns:wp14="http://schemas.microsoft.com/office/word/2010/wordprocessingDrawing" xmlns:wp="http://schemas.openxmlformats.org/drawingml/2006/wordprocessingDrawing" xmlns:w10="urn:schemas-microsoft-com:office:word" xmlns:w="http://schemas.openxmlformats.org/wordprocessingml/2006/main" xmlns:w14="http://schemas.microsoft.com/office/word/2010/wordml" xmlns:w15="http://schemas.microsoft.com/office/word/2012/wordml" xmlns:w16cex="http://schemas.microsoft.com/office/word/2018/wordml/cex" xmlns:w16cid="http://schemas.microsoft.com/office/word/2016/wordml/cid" xmlns:w16="http://schemas.microsoft.com/office/word/2018/wordml" xmlns:w16du="http://schemas.microsoft.com/office/word/2023/wordml/word16du" xmlns:w16sdtdh="http://schemas.microsoft.com/office/word/2020/wordml/sdtdatahash" xmlns:w16sdtfl="http://schemas.microsoft.com/office/word/2024/wordml/sdtformatlock" xmlns:w16se="http://schemas.microsoft.com/office/word/2015/wordml/symex" xmlns:wpg="http://schemas.microsoft.com/office/word/2010/wordprocessingGroup" xmlns:wpi="http://schemas.microsoft.com/office/word/2010/wordprocessingInk" xmlns:wne="http://schemas.microsoft.com/office/word/2006/wordml" xmlns:wps="http://schemas.microsoft.com/office/word/2010/wordprocessingShape" mc:Ignorable="w14 w15 w16se w16cid w16 w16cex w16sdtdh w16sdtfl w16du wp14">
+<w:ftr xmlns:wpc="http://schemas.microsoft.com/office/word/2010/wordprocessingCanvas" xmlns:cx="http://schemas.microsoft.com/office/drawing/2014/chartex" xmlns:cx1="http://schemas.microsoft.com/office/drawing/2015/9/8/chartex" xmlns:cx2="http://schemas.microsoft.com/office/drawing/2015/10/21/chartex" xmlns:cx3="http://schemas.microsoft.com/office/drawing/2016/5/9/chartex" xmlns:cx4="http://schemas.microsoft.com/office/drawing/2016/5/10/chartex" xmlns:cx5="http://schemas.microsoft.com/office/drawing/2016/5/11/chartex" xmlns:cx6="http://schemas.microsoft.com/office/drawing/2016/5/12/chartex" xmlns:cx7="http://schemas.microsoft.com/office/drawing/2016/5/13/chartex" xmlns:cx8="http://schemas.microsoft.com/office/drawing/2016/5/14/chartex" xmlns:mc="http://schemas.openxmlformats.org/markup-compatibility/2006" xmlns:aink="http://schemas.microsoft.com/office/drawing/2016/ink" xmlns:am3d="http://schemas.microsoft.com/office/drawing/2017/model3d" xmlns:o="urn:schemas-microsoft-com:office:office" xmlns:oel="http://schemas.microsoft.com/office/2019/extlst" xmlns:r="http://schemas.openxmlformats.org/officeDocument/2006/relationships" xmlns:m="http://schemas.openxmlformats.org/officeDocument/2006/math" xmlns:v="urn:schemas-microsoft-com:vml" xmlns:wp14="http://schemas.microsoft.com/office/word/2010/wordprocessingDrawing" xmlns:wp="http://schemas.openxmlformats.org/drawingml/2006/wordprocessingDrawing" xmlns:w10="urn:schemas-microsoft-com:office:word" xmlns:w="http://schemas.openxmlformats.org/wordprocessingml/2006/main" xmlns:w14="http://schemas.microsoft.com/office/word/2010/wordml" xmlns:w15="http://schemas.microsoft.com/office/word/2012/wordml" xmlns:w16cei="http://schemas.microsoft.com/office/word/2026/wordml/cei" xmlns:w16cex="http://schemas.microsoft.com/office/word/2018/wordml/cex" xmlns:w16cid="http://schemas.microsoft.com/office/word/2016/wordml/cid" xmlns:w16="http://schemas.microsoft.com/office/word/2018/wordml" xmlns:w16du="http://schemas.microsoft.com/office/word/2023/wordml/word16du" xmlns:w16sdtdh="http://schemas.microsoft.com/office/word/2020/wordml/sdtdatahash" xmlns:w16sdtfl="http://schemas.microsoft.com/office/word/2024/wordml/sdtformatlock" xmlns:w16se="http://schemas.microsoft.com/office/word/2015/wordml/symex" xmlns:wpg="http://schemas.microsoft.com/office/word/2010/wordprocessingGroup" xmlns:wpi="http://schemas.microsoft.com/office/word/2010/wordprocessingInk" xmlns:wne="http://schemas.microsoft.com/office/word/2006/wordml" xmlns:wps="http://schemas.microsoft.com/office/word/2010/wordprocessingShape" mc:Ignorable="w14 w15 w16se w16cid w16 w16cex w16sdtdh w16sdtfl w16du wp14">
   <w:sdt>
     <w:sdtPr>
       <w:id w:val="-321587168"/>
@@ -4962,7 +4910,7 @@
 </file>
 
 <file path=word/footnotes.xml><?xml version="1.0" encoding="utf-8"?>
-<w:footnotes xmlns:wpc="http://schemas.microsoft.com/office/word/2010/wordprocessingCanvas" xmlns:cx="http://schemas.microsoft.com/office/drawing/2014/chartex" xmlns:cx1="http://schemas.microsoft.com/office/drawing/2015/9/8/chartex" xmlns:cx2="http://schemas.microsoft.com/office/drawing/2015/10/21/chartex" xmlns:cx3="http://schemas.microsoft.com/office/drawing/2016/5/9/chartex" xmlns:cx4="http://schemas.microsoft.com/office/drawing/2016/5/10/chartex" xmlns:cx5="http://schemas.microsoft.com/office/drawing/2016/5/11/chartex" xmlns:cx6="http://schemas.microsoft.com/office/drawing/2016/5/12/chartex" xmlns:cx7="http://schemas.microsoft.com/office/drawing/2016/5/13/chartex" xmlns:cx8="http://schemas.microsoft.com/office/drawing/2016/5/14/chartex" xmlns:mc="http://schemas.openxmlformats.org/markup-compatibility/2006" xmlns:aink="http://schemas.microsoft.com/office/drawing/2016/ink" xmlns:am3d="http://schemas.microsoft.com/office/drawing/2017/model3d" xmlns:o="urn:schemas-microsoft-com:office:office" xmlns:oel="http://schemas.microsoft.com/office/2019/extlst" xmlns:r="http://schemas.openxmlformats.org/officeDocument/2006/relationships" xmlns:m="http://schemas.openxmlformats.org/officeDocument/2006/math" xmlns:v="urn:schemas-microsoft-com:vml" xmlns:wp14="http://schemas.microsoft.com/office/word/2010/wordprocessingDrawing" xmlns:wp="http://schemas.openxmlformats.org/drawingml/2006/wordprocessingDrawing" xmlns:w10="urn:schemas-microsoft-com:office:word" xmlns:w="http://schemas.openxmlformats.org/wordprocessingml/2006/main" xmlns:w14="http://schemas.microsoft.com/office/word/2010/wordml" xmlns:w15="http://schemas.microsoft.com/office/word/2012/wordml" xmlns:w16cex="http://schemas.microsoft.com/office/word/2018/wordml/cex" xmlns:w16cid="http://schemas.microsoft.com/office/word/2016/wordml/cid" xmlns:w16="http://schemas.microsoft.com/office/word/2018/wordml" xmlns:w16du="http://schemas.microsoft.com/office/word/2023/wordml/word16du" xmlns:w16sdtdh="http://schemas.microsoft.com/office/word/2020/wordml/sdtdatahash" xmlns:w16sdtfl="http://schemas.microsoft.com/office/word/2024/wordml/sdtformatlock" xmlns:w16se="http://schemas.microsoft.com/office/word/2015/wordml/symex" xmlns:wpg="http://schemas.microsoft.com/office/word/2010/wordprocessingGroup" xmlns:wpi="http://schemas.microsoft.com/office/word/2010/wordprocessingInk" xmlns:wne="http://schemas.microsoft.com/office/word/2006/wordml" xmlns:wps="http://schemas.microsoft.com/office/word/2010/wordprocessingShape" mc:Ignorable="w14 w15 w16se w16cid w16 w16cex w16sdtdh w16sdtfl w16du wp14">
+<w:footnotes xmlns:wpc="http://schemas.microsoft.com/office/word/2010/wordprocessingCanvas" xmlns:cx="http://schemas.microsoft.com/office/drawing/2014/chartex" xmlns:cx1="http://schemas.microsoft.com/office/drawing/2015/9/8/chartex" xmlns:cx2="http://schemas.microsoft.com/office/drawing/2015/10/21/chartex" xmlns:cx3="http://schemas.microsoft.com/office/drawing/2016/5/9/chartex" xmlns:cx4="http://schemas.microsoft.com/office/drawing/2016/5/10/chartex" xmlns:cx5="http://schemas.microsoft.com/office/drawing/2016/5/11/chartex" xmlns:cx6="http://schemas.microsoft.com/office/drawing/2016/5/12/chartex" xmlns:cx7="http://schemas.microsoft.com/office/drawing/2016/5/13/chartex" xmlns:cx8="http://schemas.microsoft.com/office/drawing/2016/5/14/chartex" xmlns:mc="http://schemas.openxmlformats.org/markup-compatibility/2006" xmlns:aink="http://schemas.microsoft.com/office/drawing/2016/ink" xmlns:am3d="http://schemas.microsoft.com/office/drawing/2017/model3d" xmlns:o="urn:schemas-microsoft-com:office:office" xmlns:oel="http://schemas.microsoft.com/office/2019/extlst" xmlns:r="http://schemas.openxmlformats.org/officeDocument/2006/relationships" xmlns:m="http://schemas.openxmlformats.org/officeDocument/2006/math" xmlns:v="urn:schemas-microsoft-com:vml" xmlns:wp14="http://schemas.microsoft.com/office/word/2010/wordprocessingDrawing" xmlns:wp="http://schemas.openxmlformats.org/drawingml/2006/wordprocessingDrawing" xmlns:w10="urn:schemas-microsoft-com:office:word" xmlns:w="http://schemas.openxmlformats.org/wordprocessingml/2006/main" xmlns:w14="http://schemas.microsoft.com/office/word/2010/wordml" xmlns:w15="http://schemas.microsoft.com/office/word/2012/wordml" xmlns:w16cei="http://schemas.microsoft.com/office/word/2026/wordml/cei" xmlns:w16cex="http://schemas.microsoft.com/office/word/2018/wordml/cex" xmlns:w16cid="http://schemas.microsoft.com/office/word/2016/wordml/cid" xmlns:w16="http://schemas.microsoft.com/office/word/2018/wordml" xmlns:w16du="http://schemas.microsoft.com/office/word/2023/wordml/word16du" xmlns:w16sdtdh="http://schemas.microsoft.com/office/word/2020/wordml/sdtdatahash" xmlns:w16sdtfl="http://schemas.microsoft.com/office/word/2024/wordml/sdtformatlock" xmlns:w16se="http://schemas.microsoft.com/office/word/2015/wordml/symex" xmlns:wpg="http://schemas.microsoft.com/office/word/2010/wordprocessingGroup" xmlns:wpi="http://schemas.microsoft.com/office/word/2010/wordprocessingInk" xmlns:wne="http://schemas.microsoft.com/office/word/2006/wordml" xmlns:wps="http://schemas.microsoft.com/office/word/2010/wordprocessingShape" mc:Ignorable="w14 w15 w16se w16cid w16 w16cex w16sdtdh w16sdtfl w16du wp14">
   <w:footnote w:type="separator" w:id="-1">
     <w:p>
       <w:pPr>
@@ -4987,7 +4935,7 @@
 </file>
 
 <file path=word/numbering.xml><?xml version="1.0" encoding="utf-8"?>
-<w:numbering xmlns:wpc="http://schemas.microsoft.com/office/word/2010/wordprocessingCanvas" xmlns:cx="http://schemas.microsoft.com/office/drawing/2014/chartex" xmlns:cx1="http://schemas.microsoft.com/office/drawing/2015/9/8/chartex" xmlns:cx2="http://schemas.microsoft.com/office/drawing/2015/10/21/chartex" xmlns:cx3="http://schemas.microsoft.com/office/drawing/2016/5/9/chartex" xmlns:cx4="http://schemas.microsoft.com/office/drawing/2016/5/10/chartex" xmlns:cx5="http://schemas.microsoft.com/office/drawing/2016/5/11/chartex" xmlns:cx6="http://schemas.microsoft.com/office/drawing/2016/5/12/chartex" xmlns:cx7="http://schemas.microsoft.com/office/drawing/2016/5/13/chartex" xmlns:cx8="http://schemas.microsoft.com/office/drawing/2016/5/14/chartex" xmlns:mc="http://schemas.openxmlformats.org/markup-compatibility/2006" xmlns:aink="http://schemas.microsoft.com/office/drawing/2016/ink" xmlns:am3d="http://schemas.microsoft.com/office/drawing/2017/model3d" xmlns:o="urn:schemas-microsoft-com:office:office" xmlns:oel="http://schemas.microsoft.com/office/2019/extlst" xmlns:r="http://schemas.openxmlformats.org/officeDocument/2006/relationships" xmlns:m="http://schemas.openxmlformats.org/officeDocument/2006/math" xmlns:v="urn:schemas-microsoft-com:vml" xmlns:wp14="http://schemas.microsoft.com/office/word/2010/wordprocessingDrawing" xmlns:wp="http://schemas.openxmlformats.org/drawingml/2006/wordprocessingDrawing" xmlns:w10="urn:schemas-microsoft-com:office:word" xmlns:w="http://schemas.openxmlformats.org/wordprocessingml/2006/main" xmlns:w14="http://schemas.microsoft.com/office/word/2010/wordml" xmlns:w15="http://schemas.microsoft.com/office/word/2012/wordml" xmlns:w16cex="http://schemas.microsoft.com/office/word/2018/wordml/cex" xmlns:w16cid="http://schemas.microsoft.com/office/word/2016/wordml/cid" xmlns:w16="http://schemas.microsoft.com/office/word/2018/wordml" xmlns:w16du="http://schemas.microsoft.com/office/word/2023/wordml/word16du" xmlns:w16sdtdh="http://schemas.microsoft.com/office/word/2020/wordml/sdtdatahash" xmlns:w16sdtfl="http://schemas.microsoft.com/office/word/2024/wordml/sdtformatlock" xmlns:w16se="http://schemas.microsoft.com/office/word/2015/wordml/symex" xmlns:wpg="http://schemas.microsoft.com/office/word/2010/wordprocessingGroup" xmlns:wpi="http://schemas.microsoft.com/office/word/2010/wordprocessingInk" xmlns:wne="http://schemas.microsoft.com/office/word/2006/wordml" xmlns:wps="http://schemas.microsoft.com/office/word/2010/wordprocessingShape" mc:Ignorable="w14 w15 w16se w16cid w16 w16cex w16sdtdh w16sdtfl w16du wp14">
+<w:numbering xmlns:wpc="http://schemas.microsoft.com/office/word/2010/wordprocessingCanvas" xmlns:cx="http://schemas.microsoft.com/office/drawing/2014/chartex" xmlns:cx1="http://schemas.microsoft.com/office/drawing/2015/9/8/chartex" xmlns:cx2="http://schemas.microsoft.com/office/drawing/2015/10/21/chartex" xmlns:cx3="http://schemas.microsoft.com/office/drawing/2016/5/9/chartex" xmlns:cx4="http://schemas.microsoft.com/office/drawing/2016/5/10/chartex" xmlns:cx5="http://schemas.microsoft.com/office/drawing/2016/5/11/chartex" xmlns:cx6="http://schemas.microsoft.com/office/drawing/2016/5/12/chartex" xmlns:cx7="http://schemas.microsoft.com/office/drawing/2016/5/13/chartex" xmlns:cx8="http://schemas.microsoft.com/office/drawing/2016/5/14/chartex" xmlns:mc="http://schemas.openxmlformats.org/markup-compatibility/2006" xmlns:aink="http://schemas.microsoft.com/office/drawing/2016/ink" xmlns:am3d="http://schemas.microsoft.com/office/drawing/2017/model3d" xmlns:o="urn:schemas-microsoft-com:office:office" xmlns:oel="http://schemas.microsoft.com/office/2019/extlst" xmlns:r="http://schemas.openxmlformats.org/officeDocument/2006/relationships" xmlns:m="http://schemas.openxmlformats.org/officeDocument/2006/math" xmlns:v="urn:schemas-microsoft-com:vml" xmlns:wp14="http://schemas.microsoft.com/office/word/2010/wordprocessingDrawing" xmlns:wp="http://schemas.openxmlformats.org/drawingml/2006/wordprocessingDrawing" xmlns:w10="urn:schemas-microsoft-com:office:word" xmlns:w="http://schemas.openxmlformats.org/wordprocessingml/2006/main" xmlns:w14="http://schemas.microsoft.com/office/word/2010/wordml" xmlns:w15="http://schemas.microsoft.com/office/word/2012/wordml" xmlns:w16cei="http://schemas.microsoft.com/office/word/2026/wordml/cei" xmlns:w16cex="http://schemas.microsoft.com/office/word/2018/wordml/cex" xmlns:w16cid="http://schemas.microsoft.com/office/word/2016/wordml/cid" xmlns:w16="http://schemas.microsoft.com/office/word/2018/wordml" xmlns:w16du="http://schemas.microsoft.com/office/word/2023/wordml/word16du" xmlns:w16sdtdh="http://schemas.microsoft.com/office/word/2020/wordml/sdtdatahash" xmlns:w16sdtfl="http://schemas.microsoft.com/office/word/2024/wordml/sdtformatlock" xmlns:w16se="http://schemas.microsoft.com/office/word/2015/wordml/symex" xmlns:wpg="http://schemas.microsoft.com/office/word/2010/wordprocessingGroup" xmlns:wpi="http://schemas.microsoft.com/office/word/2010/wordprocessingInk" xmlns:wne="http://schemas.microsoft.com/office/word/2006/wordml" xmlns:wps="http://schemas.microsoft.com/office/word/2010/wordprocessingShape" mc:Ignorable="w14 w15 w16se w16cid w16 w16cex w16sdtdh w16sdtfl w16du wp14">
   <w:abstractNum w:abstractNumId="0" w15:restartNumberingAfterBreak="0">
     <w:nsid w:val="FFFFFF89"/>
     <w:multiLevelType w:val="singleLevel"/>
@@ -5855,6 +5803,7 @@
   <w:style w:type="character" w:default="1" w:styleId="DefaultParagraphFont">
     <w:name w:val="Default Paragraph Font"/>
     <w:uiPriority w:val="1"/>
+    <w:semiHidden/>
     <w:unhideWhenUsed/>
   </w:style>
   <w:style w:type="table" w:default="1" w:styleId="TableNormal">

</xml_diff>